<commit_message>
Save changes before switching branch
</commit_message>
<xml_diff>
--- a/GIT_Project.docx
+++ b/GIT_Project.docx
@@ -30,6 +30,9 @@
     </w:p>
     <w:p>
       <w:r>
+        <w:rPr>
+          <w:noProof/>
+        </w:rPr>
         <w:drawing>
           <wp:inline distT="0" distB="0" distL="0" distR="0" wp14:anchorId="047A8BEE" wp14:editId="7A73402C">
             <wp:extent cx="5943600" cy="1421765"/>
@@ -80,6 +83,9 @@
     </w:p>
     <w:p>
       <w:r>
+        <w:rPr>
+          <w:noProof/>
+        </w:rPr>
         <w:drawing>
           <wp:inline distT="0" distB="0" distL="0" distR="0" wp14:anchorId="7968EC24" wp14:editId="698D73DB">
             <wp:extent cx="5943600" cy="3959225"/>
@@ -120,6 +126,9 @@
     <w:p/>
     <w:p>
       <w:r>
+        <w:rPr>
+          <w:noProof/>
+        </w:rPr>
         <w:lastRenderedPageBreak/>
         <w:drawing>
           <wp:inline distT="0" distB="0" distL="0" distR="0" wp14:anchorId="55E10D58" wp14:editId="011040BD">
@@ -235,6 +244,9 @@
     <w:p/>
     <w:p>
       <w:r>
+        <w:rPr>
+          <w:noProof/>
+        </w:rPr>
         <w:lastRenderedPageBreak/>
         <w:drawing>
           <wp:inline distT="0" distB="0" distL="0" distR="0" wp14:anchorId="68EB2A45" wp14:editId="78C78F45">
@@ -359,6 +371,9 @@
         <w:ind w:left="720"/>
       </w:pPr>
       <w:r>
+        <w:rPr>
+          <w:noProof/>
+        </w:rPr>
         <w:lastRenderedPageBreak/>
         <w:drawing>
           <wp:inline distT="0" distB="0" distL="0" distR="0" wp14:anchorId="1DDD6045" wp14:editId="05C6B8E9">
@@ -407,6 +422,9 @@
         <w:ind w:left="720"/>
       </w:pPr>
       <w:r>
+        <w:rPr>
+          <w:noProof/>
+        </w:rPr>
         <w:drawing>
           <wp:inline distT="0" distB="0" distL="0" distR="0" wp14:anchorId="5956E679" wp14:editId="733B2CB3">
             <wp:extent cx="5943600" cy="2969895"/>
@@ -453,6 +471,283 @@
       <w:pPr>
         <w:ind w:left="720"/>
       </w:pPr>
+      <w:r>
+        <w:lastRenderedPageBreak/>
+        <w:drawing>
+          <wp:inline distT="0" distB="0" distL="0" distR="0" wp14:anchorId="237AA7C7" wp14:editId="4E0BCC77">
+            <wp:extent cx="5943600" cy="2686685"/>
+            <wp:effectExtent l="0" t="0" r="0" b="0"/>
+            <wp:docPr id="716345594" name="Picture 1"/>
+            <wp:cNvGraphicFramePr>
+              <a:graphicFrameLocks xmlns:a="http://schemas.openxmlformats.org/drawingml/2006/main" noChangeAspect="1"/>
+            </wp:cNvGraphicFramePr>
+            <a:graphic xmlns:a="http://schemas.openxmlformats.org/drawingml/2006/main">
+              <a:graphicData uri="http://schemas.openxmlformats.org/drawingml/2006/picture">
+                <pic:pic xmlns:pic="http://schemas.openxmlformats.org/drawingml/2006/picture">
+                  <pic:nvPicPr>
+                    <pic:cNvPr id="716345594" name=""/>
+                    <pic:cNvPicPr/>
+                  </pic:nvPicPr>
+                  <pic:blipFill>
+                    <a:blip r:embed="rId11"/>
+                    <a:stretch>
+                      <a:fillRect/>
+                    </a:stretch>
+                  </pic:blipFill>
+                  <pic:spPr>
+                    <a:xfrm>
+                      <a:off x="0" y="0"/>
+                      <a:ext cx="5943600" cy="2686685"/>
+                    </a:xfrm>
+                    <a:prstGeom prst="rect">
+                      <a:avLst/>
+                    </a:prstGeom>
+                  </pic:spPr>
+                </pic:pic>
+              </a:graphicData>
+            </a:graphic>
+          </wp:inline>
+        </w:drawing>
+      </w:r>
+    </w:p>
+    <w:p>
+      <w:pPr>
+        <w:ind w:left="720"/>
+      </w:pPr>
+    </w:p>
+    <w:p>
+      <w:pPr>
+        <w:ind w:left="720"/>
+      </w:pPr>
+      <w:r>
+        <w:drawing>
+          <wp:inline distT="0" distB="0" distL="0" distR="0" wp14:anchorId="256C6A96" wp14:editId="3AC74BFE">
+            <wp:extent cx="5943600" cy="2642235"/>
+            <wp:effectExtent l="0" t="0" r="0" b="5715"/>
+            <wp:docPr id="864061526" name="Picture 1"/>
+            <wp:cNvGraphicFramePr>
+              <a:graphicFrameLocks xmlns:a="http://schemas.openxmlformats.org/drawingml/2006/main" noChangeAspect="1"/>
+            </wp:cNvGraphicFramePr>
+            <a:graphic xmlns:a="http://schemas.openxmlformats.org/drawingml/2006/main">
+              <a:graphicData uri="http://schemas.openxmlformats.org/drawingml/2006/picture">
+                <pic:pic xmlns:pic="http://schemas.openxmlformats.org/drawingml/2006/picture">
+                  <pic:nvPicPr>
+                    <pic:cNvPr id="864061526" name=""/>
+                    <pic:cNvPicPr/>
+                  </pic:nvPicPr>
+                  <pic:blipFill>
+                    <a:blip r:embed="rId12"/>
+                    <a:stretch>
+                      <a:fillRect/>
+                    </a:stretch>
+                  </pic:blipFill>
+                  <pic:spPr>
+                    <a:xfrm>
+                      <a:off x="0" y="0"/>
+                      <a:ext cx="5943600" cy="2642235"/>
+                    </a:xfrm>
+                    <a:prstGeom prst="rect">
+                      <a:avLst/>
+                    </a:prstGeom>
+                  </pic:spPr>
+                </pic:pic>
+              </a:graphicData>
+            </a:graphic>
+          </wp:inline>
+        </w:drawing>
+      </w:r>
+    </w:p>
+    <w:p>
+      <w:pPr>
+        <w:ind w:left="720"/>
+      </w:pPr>
+    </w:p>
+    <w:p>
+      <w:pPr>
+        <w:ind w:left="720"/>
+      </w:pPr>
+      <w:r>
+        <w:lastRenderedPageBreak/>
+        <w:drawing>
+          <wp:inline distT="0" distB="0" distL="0" distR="0" wp14:anchorId="37051FA7" wp14:editId="63252EE8">
+            <wp:extent cx="5943600" cy="3078480"/>
+            <wp:effectExtent l="0" t="0" r="0" b="7620"/>
+            <wp:docPr id="1586091560" name="Picture 1"/>
+            <wp:cNvGraphicFramePr>
+              <a:graphicFrameLocks xmlns:a="http://schemas.openxmlformats.org/drawingml/2006/main" noChangeAspect="1"/>
+            </wp:cNvGraphicFramePr>
+            <a:graphic xmlns:a="http://schemas.openxmlformats.org/drawingml/2006/main">
+              <a:graphicData uri="http://schemas.openxmlformats.org/drawingml/2006/picture">
+                <pic:pic xmlns:pic="http://schemas.openxmlformats.org/drawingml/2006/picture">
+                  <pic:nvPicPr>
+                    <pic:cNvPr id="1586091560" name=""/>
+                    <pic:cNvPicPr/>
+                  </pic:nvPicPr>
+                  <pic:blipFill>
+                    <a:blip r:embed="rId13"/>
+                    <a:stretch>
+                      <a:fillRect/>
+                    </a:stretch>
+                  </pic:blipFill>
+                  <pic:spPr>
+                    <a:xfrm>
+                      <a:off x="0" y="0"/>
+                      <a:ext cx="5943600" cy="3078480"/>
+                    </a:xfrm>
+                    <a:prstGeom prst="rect">
+                      <a:avLst/>
+                    </a:prstGeom>
+                  </pic:spPr>
+                </pic:pic>
+              </a:graphicData>
+            </a:graphic>
+          </wp:inline>
+        </w:drawing>
+      </w:r>
+    </w:p>
+    <w:p>
+      <w:pPr>
+        <w:ind w:left="720"/>
+      </w:pPr>
+    </w:p>
+    <w:p>
+      <w:pPr>
+        <w:numPr>
+          <w:ilvl w:val="0"/>
+          <w:numId w:val="5"/>
+        </w:numPr>
+      </w:pPr>
+      <w:r>
+        <w:t>What is the difference between merge and rebase, demonstrate with an example. Explain it. </w:t>
+      </w:r>
+    </w:p>
+    <w:p>
+      <w:pPr>
+        <w:ind w:left="720"/>
+      </w:pPr>
+    </w:p>
+    <w:p>
+      <w:pPr>
+        <w:ind w:left="720"/>
+      </w:pPr>
+      <w:r>
+        <w:t xml:space="preserve">git merge </w:t>
+      </w:r>
+      <w:r>
+        <w:rPr>
+          <w:b/>
+          <w:bCs/>
+        </w:rPr>
+        <w:t>combines two branches</w:t>
+      </w:r>
+      <w:r>
+        <w:t xml:space="preserve"> by creating a </w:t>
+      </w:r>
+      <w:r>
+        <w:rPr>
+          <w:b/>
+          <w:bCs/>
+        </w:rPr>
+        <w:t>new merge commit</w:t>
+      </w:r>
+      <w:r>
+        <w:t>.</w:t>
+      </w:r>
+    </w:p>
+    <w:p>
+      <w:pPr>
+        <w:ind w:left="720"/>
+      </w:pPr>
+      <w:r>
+        <w:t xml:space="preserve">git rebase </w:t>
+      </w:r>
+      <w:r>
+        <w:rPr>
+          <w:b/>
+          <w:bCs/>
+        </w:rPr>
+        <w:t>moves your branch commits on top of another branch</w:t>
+      </w:r>
+      <w:r>
+        <w:t>, rewriting history.</w:t>
+      </w:r>
+    </w:p>
+    <w:p>
+      <w:pPr>
+        <w:ind w:left="720"/>
+      </w:pPr>
+    </w:p>
+    <w:p>
+      <w:pPr>
+        <w:ind w:left="720"/>
+      </w:pPr>
+      <w:r>
+        <w:t>git checkout main</w:t>
+      </w:r>
+    </w:p>
+    <w:p>
+      <w:pPr>
+        <w:ind w:left="720"/>
+      </w:pPr>
+      <w:r>
+        <w:t>git merge feature</w:t>
+      </w:r>
+    </w:p>
+    <w:p>
+      <w:pPr>
+        <w:ind w:left="720"/>
+      </w:pPr>
+    </w:p>
+    <w:p>
+      <w:pPr>
+        <w:ind w:left="720"/>
+      </w:pPr>
+    </w:p>
+    <w:p>
+      <w:pPr>
+        <w:ind w:left="720"/>
+      </w:pPr>
+      <w:r>
+        <w:t>git checkout feature</w:t>
+      </w:r>
+    </w:p>
+    <w:p>
+      <w:pPr>
+        <w:ind w:left="720"/>
+      </w:pPr>
+      <w:proofErr w:type="gramStart"/>
+      <w:r>
+        <w:t>git</w:t>
+      </w:r>
+      <w:proofErr w:type="gramEnd"/>
+      <w:r>
+        <w:t xml:space="preserve"> rebase main</w:t>
+      </w:r>
+    </w:p>
+    <w:p>
+      <w:pPr>
+        <w:ind w:left="720"/>
+      </w:pPr>
+    </w:p>
+    <w:p>
+      <w:pPr>
+        <w:ind w:left="720"/>
+      </w:pPr>
+    </w:p>
+    <w:p>
+      <w:pPr>
+        <w:ind w:left="720"/>
+      </w:pPr>
+    </w:p>
+    <w:p>
+      <w:pPr>
+        <w:ind w:left="720"/>
+      </w:pPr>
+    </w:p>
+    <w:p>
+      <w:pPr>
+        <w:ind w:left="720"/>
+      </w:pPr>
     </w:p>
     <w:p/>
     <w:sectPr>
@@ -807,6 +1102,119 @@
     </w:lvl>
   </w:abstractNum>
   <w:abstractNum w:abstractNumId="3" w15:restartNumberingAfterBreak="0">
+    <w:nsid w:val="4A0C0285"/>
+    <w:multiLevelType w:val="multilevel"/>
+    <w:tmpl w:val="AFA26780"/>
+    <w:lvl w:ilvl="0">
+      <w:start w:val="12"/>
+      <w:numFmt w:val="decimal"/>
+      <w:lvlText w:val="%1."/>
+      <w:lvlJc w:val="left"/>
+      <w:pPr>
+        <w:tabs>
+          <w:tab w:val="num" w:pos="720"/>
+        </w:tabs>
+        <w:ind w:left="720" w:hanging="360"/>
+      </w:pPr>
+    </w:lvl>
+    <w:lvl w:ilvl="1">
+      <w:start w:val="1"/>
+      <w:numFmt w:val="decimal"/>
+      <w:lvlText w:val="%2."/>
+      <w:lvlJc w:val="left"/>
+      <w:pPr>
+        <w:tabs>
+          <w:tab w:val="num" w:pos="1440"/>
+        </w:tabs>
+        <w:ind w:left="1440" w:hanging="360"/>
+      </w:pPr>
+    </w:lvl>
+    <w:lvl w:ilvl="2">
+      <w:start w:val="1"/>
+      <w:numFmt w:val="decimal"/>
+      <w:lvlText w:val="%3."/>
+      <w:lvlJc w:val="left"/>
+      <w:pPr>
+        <w:tabs>
+          <w:tab w:val="num" w:pos="2160"/>
+        </w:tabs>
+        <w:ind w:left="2160" w:hanging="360"/>
+      </w:pPr>
+    </w:lvl>
+    <w:lvl w:ilvl="3">
+      <w:start w:val="1"/>
+      <w:numFmt w:val="decimal"/>
+      <w:lvlText w:val="%4."/>
+      <w:lvlJc w:val="left"/>
+      <w:pPr>
+        <w:tabs>
+          <w:tab w:val="num" w:pos="2880"/>
+        </w:tabs>
+        <w:ind w:left="2880" w:hanging="360"/>
+      </w:pPr>
+    </w:lvl>
+    <w:lvl w:ilvl="4">
+      <w:start w:val="1"/>
+      <w:numFmt w:val="decimal"/>
+      <w:lvlText w:val="%5."/>
+      <w:lvlJc w:val="left"/>
+      <w:pPr>
+        <w:tabs>
+          <w:tab w:val="num" w:pos="3600"/>
+        </w:tabs>
+        <w:ind w:left="3600" w:hanging="360"/>
+      </w:pPr>
+    </w:lvl>
+    <w:lvl w:ilvl="5">
+      <w:start w:val="1"/>
+      <w:numFmt w:val="decimal"/>
+      <w:lvlText w:val="%6."/>
+      <w:lvlJc w:val="left"/>
+      <w:pPr>
+        <w:tabs>
+          <w:tab w:val="num" w:pos="4320"/>
+        </w:tabs>
+        <w:ind w:left="4320" w:hanging="360"/>
+      </w:pPr>
+    </w:lvl>
+    <w:lvl w:ilvl="6">
+      <w:start w:val="1"/>
+      <w:numFmt w:val="decimal"/>
+      <w:lvlText w:val="%7."/>
+      <w:lvlJc w:val="left"/>
+      <w:pPr>
+        <w:tabs>
+          <w:tab w:val="num" w:pos="5040"/>
+        </w:tabs>
+        <w:ind w:left="5040" w:hanging="360"/>
+      </w:pPr>
+    </w:lvl>
+    <w:lvl w:ilvl="7">
+      <w:start w:val="1"/>
+      <w:numFmt w:val="decimal"/>
+      <w:lvlText w:val="%8."/>
+      <w:lvlJc w:val="left"/>
+      <w:pPr>
+        <w:tabs>
+          <w:tab w:val="num" w:pos="5760"/>
+        </w:tabs>
+        <w:ind w:left="5760" w:hanging="360"/>
+      </w:pPr>
+    </w:lvl>
+    <w:lvl w:ilvl="8">
+      <w:start w:val="1"/>
+      <w:numFmt w:val="decimal"/>
+      <w:lvlText w:val="%9."/>
+      <w:lvlJc w:val="left"/>
+      <w:pPr>
+        <w:tabs>
+          <w:tab w:val="num" w:pos="6480"/>
+        </w:tabs>
+        <w:ind w:left="6480" w:hanging="360"/>
+      </w:pPr>
+    </w:lvl>
+  </w:abstractNum>
+  <w:abstractNum w:abstractNumId="4" w15:restartNumberingAfterBreak="0">
     <w:nsid w:val="54EC2A30"/>
     <w:multiLevelType w:val="multilevel"/>
     <w:tmpl w:val="6A6C1772"/>
@@ -926,10 +1334,40 @@
     <w:abstractNumId w:val="0"/>
   </w:num>
   <w:num w:numId="3" w16cid:durableId="1631085793">
-    <w:abstractNumId w:val="3"/>
+    <w:abstractNumId w:val="4"/>
   </w:num>
   <w:num w:numId="4" w16cid:durableId="1402943817">
     <w:abstractNumId w:val="1"/>
+  </w:num>
+  <w:num w:numId="5" w16cid:durableId="1085296511">
+    <w:abstractNumId w:val="3"/>
+    <w:lvlOverride w:ilvl="0">
+      <w:startOverride w:val="12"/>
+    </w:lvlOverride>
+    <w:lvlOverride w:ilvl="1">
+      <w:startOverride w:val="1"/>
+    </w:lvlOverride>
+    <w:lvlOverride w:ilvl="2">
+      <w:startOverride w:val="1"/>
+    </w:lvlOverride>
+    <w:lvlOverride w:ilvl="3">
+      <w:startOverride w:val="1"/>
+    </w:lvlOverride>
+    <w:lvlOverride w:ilvl="4">
+      <w:startOverride w:val="1"/>
+    </w:lvlOverride>
+    <w:lvlOverride w:ilvl="5">
+      <w:startOverride w:val="1"/>
+    </w:lvlOverride>
+    <w:lvlOverride w:ilvl="6">
+      <w:startOverride w:val="1"/>
+    </w:lvlOverride>
+    <w:lvlOverride w:ilvl="7">
+      <w:startOverride w:val="1"/>
+    </w:lvlOverride>
+    <w:lvlOverride w:ilvl="8">
+      <w:startOverride w:val="1"/>
+    </w:lvlOverride>
   </w:num>
 </w:numbering>
 </file>
@@ -1537,7 +1975,6 @@
   <w:style w:type="character" w:default="1" w:styleId="DefaultParagraphFont">
     <w:name w:val="Default Paragraph Font"/>
     <w:uiPriority w:val="1"/>
-    <w:semiHidden/>
     <w:unhideWhenUsed/>
   </w:style>
   <w:style w:type="table" w:default="1" w:styleId="TableNormal">

</xml_diff>